<commit_message>
Update FR non-compete/non-solicit and restricted stock agreement templates to v2
</commit_message>
<xml_diff>
--- a/backend/templates-src/non-compete-non-solicit-fr.docx
+++ b/backend/templates-src/non-compete-non-solicit-fr.docx
@@ -368,27 +368,7 @@
           <w:szCs w:val="22"/>
           <w:lang w:val="fr-CA"/>
         </w:rPr>
-        <w:t>(</w:t>
-      </w:r>
-      <w:proofErr w:type="gramStart"/>
-      <w:r>
-        <w:rPr>
-          <w:rFonts w:ascii="Book Antiqua" w:hAnsi="Book Antiqua" w:cs="Arial"/>
-          <w:color w:val="000000"/>
-          <w:szCs w:val="22"/>
-          <w:lang w:val="fr-CA"/>
-        </w:rPr>
-        <w:t>ci</w:t>
-      </w:r>
-      <w:proofErr w:type="gramEnd"/>
-      <w:r>
-        <w:rPr>
-          <w:rFonts w:ascii="Book Antiqua" w:hAnsi="Book Antiqua" w:cs="Arial"/>
-          <w:color w:val="000000"/>
-          <w:szCs w:val="22"/>
-          <w:lang w:val="fr-CA"/>
-        </w:rPr>
-        <w:t>-après, le «</w:t>
+        <w:t>(ci-après, le «</w:t>
       </w:r>
       <w:r>
         <w:rPr>
@@ -602,25 +582,7 @@
           <w:bCs/>
           <w:lang w:val="fr-CA"/>
         </w:rPr>
-        <w:t>(</w:t>
-      </w:r>
-      <w:proofErr w:type="gramStart"/>
-      <w:r>
-        <w:rPr>
-          <w:rFonts w:ascii="Book Antiqua" w:hAnsi="Book Antiqua"/>
-          <w:bCs/>
-          <w:lang w:val="fr-CA"/>
-        </w:rPr>
-        <w:t>ci</w:t>
-      </w:r>
-      <w:proofErr w:type="gramEnd"/>
-      <w:r>
-        <w:rPr>
-          <w:rFonts w:ascii="Book Antiqua" w:hAnsi="Book Antiqua"/>
-          <w:bCs/>
-          <w:lang w:val="fr-CA"/>
-        </w:rPr>
-        <w:t xml:space="preserve">-après, la « </w:t>
+        <w:t xml:space="preserve">(ci-après, la « </w:t>
       </w:r>
       <w:r>
         <w:rPr>
@@ -655,25 +617,7 @@
           <w:bCs/>
           <w:lang w:val="fr-CA"/>
         </w:rPr>
-        <w:t>(</w:t>
-      </w:r>
-      <w:proofErr w:type="gramStart"/>
-      <w:r>
-        <w:rPr>
-          <w:rFonts w:ascii="Book Antiqua" w:hAnsi="Book Antiqua"/>
-          <w:bCs/>
-          <w:lang w:val="fr-CA"/>
-        </w:rPr>
-        <w:t>collectivement</w:t>
-      </w:r>
-      <w:proofErr w:type="gramEnd"/>
-      <w:r>
-        <w:rPr>
-          <w:rFonts w:ascii="Book Antiqua" w:hAnsi="Book Antiqua"/>
-          <w:bCs/>
-          <w:lang w:val="fr-CA"/>
-        </w:rPr>
-        <w:t xml:space="preserve">, les « </w:t>
+        <w:t xml:space="preserve">(collectivement, les « </w:t>
       </w:r>
       <w:r>
         <w:rPr>
@@ -858,7 +802,6 @@
         </w:rPr>
         <w:t>à la Société (l</w:t>
       </w:r>
-      <w:proofErr w:type="gramStart"/>
       <w:r>
         <w:rPr>
           <w:rFonts w:ascii="Book Antiqua" w:hAnsi="Book Antiqua"/>
@@ -875,17 +818,7 @@
           <w:szCs w:val="22"/>
           <w:lang w:val="fr-CA"/>
         </w:rPr>
-        <w:t>«</w:t>
-      </w:r>
-      <w:proofErr w:type="gramEnd"/>
-      <w:r>
-        <w:rPr>
-          <w:rFonts w:ascii="Book Antiqua" w:hAnsi="Book Antiqua"/>
-          <w:bCs/>
-          <w:szCs w:val="22"/>
-          <w:lang w:val="fr-CA"/>
-        </w:rPr>
-        <w:t xml:space="preserve"> </w:t>
+        <w:t xml:space="preserve">« </w:t>
       </w:r>
       <w:r>
         <w:rPr>
@@ -1354,7 +1287,6 @@
           <w:lang w:val="fr-CA"/>
         </w:rPr>
       </w:pPr>
-      <w:proofErr w:type="gramStart"/>
       <w:r>
         <w:rPr>
           <w:rFonts w:ascii="Book Antiqua" w:hAnsi="Book Antiqua" w:cs="Arial"/>
@@ -1371,17 +1303,7 @@
           <w:szCs w:val="22"/>
           <w:lang w:val="fr-CA"/>
         </w:rPr>
-        <w:t>ermettre</w:t>
-      </w:r>
-      <w:proofErr w:type="gramEnd"/>
-      <w:r>
-        <w:rPr>
-          <w:rFonts w:ascii="Book Antiqua" w:hAnsi="Book Antiqua" w:cs="Arial"/>
-          <w:bCs/>
-          <w:szCs w:val="22"/>
-          <w:lang w:val="fr-CA"/>
-        </w:rPr>
-        <w:t xml:space="preserve"> à l</w:t>
+        <w:t>ermettre à l</w:t>
       </w:r>
       <w:r>
         <w:rPr>
@@ -1983,15 +1905,23 @@
           <w:szCs w:val="22"/>
           <w:lang w:val="fr-CA"/>
         </w:rPr>
-        <w:t>dessous) chaque</w:t>
-      </w:r>
-      <w:r>
-        <w:rPr>
-          <w:rFonts w:ascii="Book Antiqua" w:hAnsi="Book Antiqua" w:cs="Arial"/>
-          <w:szCs w:val="22"/>
-          <w:lang w:val="fr-CA"/>
-        </w:rPr>
-        <w:t xml:space="preserve"> Partie s’engage à ne pas, sans le consentement préalable </w:t>
+        <w:t xml:space="preserve">dessous) </w:t>
+      </w:r>
+      <w:r>
+        <w:rPr>
+          <w:rFonts w:ascii="Book Antiqua" w:hAnsi="Book Antiqua" w:cs="Arial"/>
+          <w:szCs w:val="22"/>
+          <w:lang w:val="fr-CA"/>
+        </w:rPr>
+        <w:t>le Principal</w:t>
+      </w:r>
+      <w:r>
+        <w:rPr>
+          <w:rFonts w:ascii="Book Antiqua" w:hAnsi="Book Antiqua" w:cs="Arial"/>
+          <w:szCs w:val="22"/>
+          <w:lang w:val="fr-CA"/>
+        </w:rPr>
+        <w:t xml:space="preserve"> s’engage à ne pas, sans le consentement préalable </w:t>
       </w:r>
       <w:r>
         <w:rPr>
@@ -2304,7 +2234,6 @@
         </w:rPr>
         <w:t xml:space="preserve"> </w:t>
       </w:r>
-      <w:proofErr w:type="gramStart"/>
       <w:r>
         <w:rPr>
           <w:rFonts w:ascii="Book Antiqua" w:eastAsia="Book Antiqua" w:hAnsi="Book Antiqua" w:cs="Book Antiqua"/>
@@ -2321,9 +2250,8 @@
           <w:szCs w:val="22"/>
           <w:lang w:val="fr-CA"/>
         </w:rPr>
-        <w:t>ersonnellement</w:t>
-      </w:r>
-      <w:proofErr w:type="gramEnd"/>
+        <w:t xml:space="preserve">ersonnellement, ou par l’intermédiaire de tiers, inciter sciemment, encourager, recruter ou solliciter (pour son propre compte ou pour celui de toute autre personne), ou entreprendre toute autre démarche visant à inciter ou à encourager sciemment un Travailleur de la Société à participer à une activité à laquelle cette Partie serait interdite de prendre part en vertu des dispositions </w:t>
+      </w:r>
       <w:r>
         <w:rPr>
           <w:rFonts w:ascii="Book Antiqua" w:eastAsia="Book Antiqua" w:hAnsi="Book Antiqua" w:cs="Book Antiqua"/>
@@ -2331,7 +2259,7 @@
           <w:szCs w:val="22"/>
           <w:lang w:val="fr-CA"/>
         </w:rPr>
-        <w:t xml:space="preserve">, ou par l’intermédiaire de tiers, inciter sciemment, encourager, recruter ou solliciter (pour son propre compte ou pour celui de toute autre personne), ou entreprendre toute autre démarche visant à inciter ou à encourager sciemment un Travailleur de la Société à participer à une activité à laquelle cette Partie serait interdite de prendre part en vertu des dispositions </w:t>
+        <w:t>de l’Article</w:t>
       </w:r>
       <w:r>
         <w:rPr>
@@ -2340,7 +2268,7 @@
           <w:szCs w:val="22"/>
           <w:lang w:val="fr-CA"/>
         </w:rPr>
-        <w:t>de l’Article</w:t>
+        <w:t xml:space="preserve"> </w:t>
       </w:r>
       <w:r>
         <w:rPr>
@@ -2349,7 +2277,7 @@
           <w:szCs w:val="22"/>
           <w:lang w:val="fr-CA"/>
         </w:rPr>
-        <w:t xml:space="preserve"> </w:t>
+        <w:fldChar w:fldCharType="begin"/>
       </w:r>
       <w:r>
         <w:rPr>
@@ -2358,7 +2286,7 @@
           <w:szCs w:val="22"/>
           <w:lang w:val="fr-CA"/>
         </w:rPr>
-        <w:fldChar w:fldCharType="begin"/>
+        <w:instrText xml:space="preserve"> REF _Ref189481241 \r \h </w:instrText>
       </w:r>
       <w:r>
         <w:rPr>
@@ -2367,7 +2295,7 @@
           <w:szCs w:val="22"/>
           <w:lang w:val="fr-CA"/>
         </w:rPr>
-        <w:instrText xml:space="preserve"> REF _Ref189481241 \r \h </w:instrText>
+        <w:instrText xml:space="preserve"> \* MERGEFORMAT </w:instrText>
       </w:r>
       <w:r>
         <w:rPr>
@@ -2376,7 +2304,6 @@
           <w:szCs w:val="22"/>
           <w:lang w:val="fr-CA"/>
         </w:rPr>
-        <w:instrText xml:space="preserve"> \* MERGEFORMAT </w:instrText>
       </w:r>
       <w:r>
         <w:rPr>
@@ -2385,6 +2312,7 @@
           <w:szCs w:val="22"/>
           <w:lang w:val="fr-CA"/>
         </w:rPr>
+        <w:fldChar w:fldCharType="separate"/>
       </w:r>
       <w:r>
         <w:rPr>
@@ -2393,7 +2321,7 @@
           <w:szCs w:val="22"/>
           <w:lang w:val="fr-CA"/>
         </w:rPr>
-        <w:fldChar w:fldCharType="separate"/>
+        <w:t>1</w:t>
       </w:r>
       <w:r>
         <w:rPr>
@@ -2402,7 +2330,7 @@
           <w:szCs w:val="22"/>
           <w:lang w:val="fr-CA"/>
         </w:rPr>
-        <w:t>1</w:t>
+        <w:fldChar w:fldCharType="end"/>
       </w:r>
       <w:r>
         <w:rPr>
@@ -2411,7 +2339,7 @@
           <w:szCs w:val="22"/>
           <w:lang w:val="fr-CA"/>
         </w:rPr>
-        <w:fldChar w:fldCharType="end"/>
+        <w:t xml:space="preserve"> </w:t>
       </w:r>
       <w:r>
         <w:rPr>
@@ -2420,7 +2348,7 @@
           <w:szCs w:val="22"/>
           <w:lang w:val="fr-CA"/>
         </w:rPr>
-        <w:t xml:space="preserve"> </w:t>
+        <w:t>de la présente Entente</w:t>
       </w:r>
       <w:r>
         <w:rPr>
@@ -2429,36 +2357,7 @@
           <w:szCs w:val="22"/>
           <w:lang w:val="fr-CA"/>
         </w:rPr>
-        <w:t>de la présente Entente</w:t>
-      </w:r>
-      <w:r>
-        <w:rPr>
-          <w:rFonts w:ascii="Book Antiqua" w:eastAsia="Book Antiqua" w:hAnsi="Book Antiqua" w:cs="Book Antiqua"/>
-          <w:color w:val="000000"/>
-          <w:szCs w:val="22"/>
-          <w:lang w:val="fr-CA"/>
-        </w:rPr>
-        <w:t xml:space="preserve">; </w:t>
-      </w:r>
-      <w:proofErr w:type="gramStart"/>
-      <w:r>
-        <w:rPr>
-          <w:rFonts w:ascii="Book Antiqua" w:eastAsia="Book Antiqua" w:hAnsi="Book Antiqua" w:cs="Book Antiqua"/>
-          <w:color w:val="000000"/>
-          <w:szCs w:val="22"/>
-          <w:lang w:val="fr-CA"/>
-        </w:rPr>
-        <w:t>ou</w:t>
-      </w:r>
-      <w:proofErr w:type="gramEnd"/>
-      <w:r>
-        <w:rPr>
-          <w:rFonts w:ascii="Book Antiqua" w:eastAsia="Book Antiqua" w:hAnsi="Book Antiqua" w:cs="Book Antiqua"/>
-          <w:color w:val="000000"/>
-          <w:szCs w:val="22"/>
-          <w:lang w:val="fr-CA"/>
-        </w:rPr>
-        <w:t xml:space="preserve"> </w:t>
+        <w:t xml:space="preserve">; ou </w:t>
       </w:r>
     </w:p>
     <w:p>
@@ -2476,7 +2375,6 @@
           <w:lang w:val="fr-CA"/>
         </w:rPr>
       </w:pPr>
-      <w:proofErr w:type="gramStart"/>
       <w:r>
         <w:rPr>
           <w:rFonts w:ascii="Book Antiqua" w:eastAsia="Book Antiqua" w:hAnsi="Book Antiqua" w:cs="Book Antiqua"/>
@@ -2484,17 +2382,7 @@
           <w:szCs w:val="22"/>
           <w:lang w:val="fr-CA"/>
         </w:rPr>
-        <w:t>personnellement</w:t>
-      </w:r>
-      <w:proofErr w:type="gramEnd"/>
-      <w:r>
-        <w:rPr>
-          <w:rFonts w:ascii="Book Antiqua" w:eastAsia="Book Antiqua" w:hAnsi="Book Antiqua" w:cs="Book Antiqua"/>
-          <w:color w:val="000000"/>
-          <w:szCs w:val="22"/>
-          <w:lang w:val="fr-CA"/>
-        </w:rPr>
-        <w:t xml:space="preserve">, ou par l’intermédiaire de tiers, </w:t>
+        <w:t xml:space="preserve">personnellement, ou par l’intermédiaire de tiers, </w:t>
       </w:r>
       <w:r>
         <w:rPr>
@@ -3461,25 +3349,7 @@
           <w:szCs w:val="22"/>
           <w:lang w:val="fr-CA"/>
         </w:rPr>
-        <w:t xml:space="preserve">une enquête ou d’une autre action gouvernementale, ainsi que celles incluses dans un document juridique déposé en </w:t>
-      </w:r>
-      <w:proofErr w:type="gramStart"/>
-      <w:r>
-        <w:rPr>
-          <w:rFonts w:ascii="Book Antiqua" w:hAnsi="Book Antiqua" w:cs="Arial"/>
-          <w:szCs w:val="22"/>
-          <w:lang w:val="fr-CA"/>
-        </w:rPr>
-        <w:t>cour</w:t>
-      </w:r>
-      <w:proofErr w:type="gramEnd"/>
-      <w:r>
-        <w:rPr>
-          <w:rFonts w:ascii="Book Antiqua" w:hAnsi="Book Antiqua" w:cs="Arial"/>
-          <w:szCs w:val="22"/>
-          <w:lang w:val="fr-CA"/>
-        </w:rPr>
-        <w:t>).</w:t>
+        <w:t>une enquête ou d’une autre action gouvernementale, ainsi que celles incluses dans un document juridique déposé en cour).</w:t>
       </w:r>
       <w:bookmarkEnd w:id="5"/>
     </w:p>
@@ -3568,7 +3438,6 @@
           <w:lang w:val="fr-CA"/>
         </w:rPr>
       </w:pPr>
-      <w:proofErr w:type="gramStart"/>
       <w:r>
         <w:rPr>
           <w:rFonts w:ascii="Book Antiqua" w:hAnsi="Book Antiqua" w:cs="Arial"/>
@@ -3591,16 +3460,7 @@
           <w:szCs w:val="22"/>
           <w:lang w:val="fr-CA"/>
         </w:rPr>
-        <w:t>te</w:t>
-      </w:r>
-      <w:proofErr w:type="gramEnd"/>
-      <w:r>
-        <w:rPr>
-          <w:rFonts w:ascii="Book Antiqua" w:hAnsi="Book Antiqua" w:cs="Arial"/>
-          <w:szCs w:val="22"/>
-          <w:lang w:val="fr-CA"/>
-        </w:rPr>
-        <w:t xml:space="preserve"> Entente </w:t>
+        <w:t xml:space="preserve">te Entente </w:t>
       </w:r>
       <w:r>
         <w:rPr>
@@ -3652,23 +3512,13 @@
           <w:lang w:val="fr-CA"/>
         </w:rPr>
       </w:pPr>
-      <w:proofErr w:type="gramStart"/>
-      <w:r>
-        <w:rPr>
-          <w:rFonts w:ascii="Book Antiqua" w:hAnsi="Book Antiqua" w:cs="Arial"/>
-          <w:szCs w:val="22"/>
-          <w:lang w:val="fr-CA"/>
-        </w:rPr>
-        <w:t>l’étendue</w:t>
-      </w:r>
-      <w:proofErr w:type="gramEnd"/>
-      <w:r>
-        <w:rPr>
-          <w:rFonts w:ascii="Book Antiqua" w:hAnsi="Book Antiqua" w:cs="Arial"/>
-          <w:szCs w:val="22"/>
-          <w:lang w:val="fr-CA"/>
-        </w:rPr>
-        <w:t xml:space="preserve"> de cet</w:t>
+      <w:r>
+        <w:rPr>
+          <w:rFonts w:ascii="Book Antiqua" w:hAnsi="Book Antiqua" w:cs="Arial"/>
+          <w:szCs w:val="22"/>
+          <w:lang w:val="fr-CA"/>
+        </w:rPr>
+        <w:t>l’étendue de cet</w:t>
       </w:r>
       <w:r>
         <w:rPr>
@@ -3712,23 +3562,13 @@
           <w:lang w:val="fr-CA"/>
         </w:rPr>
       </w:pPr>
-      <w:proofErr w:type="gramStart"/>
-      <w:r>
-        <w:rPr>
-          <w:rFonts w:ascii="Book Antiqua" w:hAnsi="Book Antiqua" w:cs="Arial"/>
-          <w:szCs w:val="22"/>
-          <w:lang w:val="fr-CA"/>
-        </w:rPr>
-        <w:t>le</w:t>
-      </w:r>
-      <w:proofErr w:type="gramEnd"/>
-      <w:r>
-        <w:rPr>
-          <w:rFonts w:ascii="Book Antiqua" w:hAnsi="Book Antiqua" w:cs="Arial"/>
-          <w:szCs w:val="22"/>
-          <w:lang w:val="fr-CA"/>
-        </w:rPr>
-        <w:t xml:space="preserve"> Principal n’a pas</w:t>
+      <w:r>
+        <w:rPr>
+          <w:rFonts w:ascii="Book Antiqua" w:hAnsi="Book Antiqua" w:cs="Arial"/>
+          <w:szCs w:val="22"/>
+          <w:lang w:val="fr-CA"/>
+        </w:rPr>
+        <w:t>le Principal n’a pas</w:t>
       </w:r>
       <w:r>
         <w:rPr>
@@ -3780,23 +3620,13 @@
           <w:lang w:val="fr-CA"/>
         </w:rPr>
       </w:pPr>
-      <w:proofErr w:type="gramStart"/>
-      <w:r>
-        <w:rPr>
-          <w:rFonts w:ascii="Book Antiqua" w:hAnsi="Book Antiqua" w:cs="Arial"/>
-          <w:szCs w:val="22"/>
-          <w:lang w:val="fr-CA"/>
-        </w:rPr>
-        <w:t>le</w:t>
-      </w:r>
-      <w:proofErr w:type="gramEnd"/>
-      <w:r>
-        <w:rPr>
-          <w:rFonts w:ascii="Book Antiqua" w:hAnsi="Book Antiqua" w:cs="Arial"/>
-          <w:szCs w:val="22"/>
-          <w:lang w:val="fr-CA"/>
-        </w:rPr>
-        <w:t xml:space="preserve"> Principal</w:t>
+      <w:r>
+        <w:rPr>
+          <w:rFonts w:ascii="Book Antiqua" w:hAnsi="Book Antiqua" w:cs="Arial"/>
+          <w:szCs w:val="22"/>
+          <w:lang w:val="fr-CA"/>
+        </w:rPr>
+        <w:t>le Principal</w:t>
       </w:r>
       <w:r>
         <w:rPr>
@@ -3880,7 +3710,6 @@
           <w:lang w:val="fr-CA"/>
         </w:rPr>
       </w:pPr>
-      <w:proofErr w:type="gramStart"/>
       <w:r>
         <w:rPr>
           <w:rFonts w:ascii="Book Antiqua" w:hAnsi="Book Antiqua" w:cs="Arial"/>
@@ -3888,16 +3717,7 @@
           <w:lang w:val="fr-CA"/>
         </w:rPr>
         <w:lastRenderedPageBreak/>
-        <w:t>la</w:t>
-      </w:r>
-      <w:proofErr w:type="gramEnd"/>
-      <w:r>
-        <w:rPr>
-          <w:rFonts w:ascii="Book Antiqua" w:hAnsi="Book Antiqua" w:cs="Arial"/>
-          <w:szCs w:val="22"/>
-          <w:lang w:val="fr-CA"/>
-        </w:rPr>
-        <w:t xml:space="preserve"> signature par les Parties</w:t>
+        <w:t>la signature par les Parties</w:t>
       </w:r>
       <w:r>
         <w:rPr>
@@ -4005,23 +3825,13 @@
           <w:lang w:val="fr-CA"/>
         </w:rPr>
       </w:pPr>
-      <w:proofErr w:type="gramStart"/>
-      <w:r>
-        <w:rPr>
-          <w:rFonts w:ascii="Book Antiqua" w:hAnsi="Book Antiqua" w:cs="Arial"/>
-          <w:szCs w:val="22"/>
-          <w:lang w:val="fr-CA"/>
-        </w:rPr>
-        <w:t>le</w:t>
-      </w:r>
-      <w:proofErr w:type="gramEnd"/>
-      <w:r>
-        <w:rPr>
-          <w:rFonts w:ascii="Book Antiqua" w:hAnsi="Book Antiqua" w:cs="Arial"/>
-          <w:szCs w:val="22"/>
-          <w:lang w:val="fr-CA"/>
-        </w:rPr>
-        <w:t xml:space="preserve"> Principal déclare et garantit que ses compétences et aptitudes sont suffisantes pour que l</w:t>
+      <w:r>
+        <w:rPr>
+          <w:rFonts w:ascii="Book Antiqua" w:hAnsi="Book Antiqua" w:cs="Arial"/>
+          <w:szCs w:val="22"/>
+          <w:lang w:val="fr-CA"/>
+        </w:rPr>
+        <w:t>le Principal déclare et garantit que ses compétences et aptitudes sont suffisantes pour que l</w:t>
       </w:r>
       <w:r>
         <w:rPr>
@@ -4426,34 +4236,14 @@
         </w:rPr>
         <w:t xml:space="preserve">de </w:t>
       </w:r>
-      <w:proofErr w:type="spellStart"/>
-      <w:r>
-        <w:rPr>
-          <w:rFonts w:ascii="Book Antiqua" w:hAnsi="Book Antiqua"/>
-          <w:szCs w:val="22"/>
-          <w:lang w:val="fr-CA"/>
-        </w:rPr>
-        <w:t>common</w:t>
-      </w:r>
-      <w:proofErr w:type="spellEnd"/>
-      <w:r>
-        <w:rPr>
-          <w:rFonts w:ascii="Book Antiqua" w:hAnsi="Book Antiqua"/>
-          <w:szCs w:val="22"/>
-          <w:lang w:val="fr-CA"/>
-        </w:rPr>
-        <w:t xml:space="preserve"> </w:t>
-      </w:r>
-      <w:proofErr w:type="spellStart"/>
-      <w:r>
-        <w:rPr>
-          <w:rFonts w:ascii="Book Antiqua" w:hAnsi="Book Antiqua"/>
-          <w:szCs w:val="22"/>
-          <w:lang w:val="fr-CA"/>
-        </w:rPr>
-        <w:t>law</w:t>
-      </w:r>
-      <w:proofErr w:type="spellEnd"/>
+      <w:r>
+        <w:rPr>
+          <w:rFonts w:ascii="Book Antiqua" w:hAnsi="Book Antiqua"/>
+          <w:szCs w:val="22"/>
+          <w:lang w:val="fr-CA"/>
+        </w:rPr>
+        <w:t>common law</w:t>
+      </w:r>
       <w:r>
         <w:rPr>
           <w:rFonts w:ascii="Book Antiqua" w:hAnsi="Book Antiqua"/>
@@ -5793,7 +5583,7 @@
           <w:lang w:val="fr-CA"/>
         </w:rPr>
         <w:sectPr>
-          <w:headerReference w:type="default" r:id="rId8"/>
+          <w:headerReference w:type="default" r:id="rId11"/>
           <w:footnotePr>
             <w:numRestart w:val="eachSect"/>
           </w:footnotePr>
@@ -6182,34 +5972,14 @@
           <w:szCs w:val="22"/>
         </w:rPr>
       </w:pPr>
-      <w:proofErr w:type="spellStart"/>
-      <w:r>
-        <w:rPr>
-          <w:rFonts w:ascii="Book Antiqua" w:hAnsi="Book Antiqua"/>
-          <w:bCs/>
-          <w:szCs w:val="22"/>
-        </w:rPr>
-        <w:t>Signataire</w:t>
-      </w:r>
-      <w:proofErr w:type="spellEnd"/>
-      <w:r>
-        <w:rPr>
-          <w:rFonts w:ascii="Book Antiqua" w:hAnsi="Book Antiqua"/>
-          <w:bCs/>
-          <w:szCs w:val="22"/>
-        </w:rPr>
-        <w:t xml:space="preserve"> </w:t>
-      </w:r>
-      <w:proofErr w:type="spellStart"/>
-      <w:r>
-        <w:rPr>
-          <w:rFonts w:ascii="Book Antiqua" w:hAnsi="Book Antiqua"/>
-          <w:bCs/>
-          <w:szCs w:val="22"/>
-        </w:rPr>
-        <w:t>autorisé</w:t>
-      </w:r>
-      <w:proofErr w:type="spellEnd"/>
+      <w:r>
+        <w:rPr>
+          <w:rFonts w:ascii="Book Antiqua" w:hAnsi="Book Antiqua"/>
+          <w:bCs/>
+          <w:szCs w:val="22"/>
+        </w:rPr>
+        <w:t>Signataire autorisé</w:t>
+      </w:r>
     </w:p>
     <w:p>
       <w:pPr>
@@ -6234,10 +6004,10 @@
       </w:pPr>
     </w:p>
     <w:sectPr>
-      <w:footerReference w:type="even" r:id="rId9"/>
-      <w:footerReference w:type="default" r:id="rId10"/>
-      <w:headerReference w:type="first" r:id="rId11"/>
-      <w:footerReference w:type="first" r:id="rId12"/>
+      <w:footerReference w:type="even" r:id="rId12"/>
+      <w:footerReference w:type="default" r:id="rId13"/>
+      <w:headerReference w:type="first" r:id="rId14"/>
+      <w:footerReference w:type="first" r:id="rId15"/>
       <w:pgSz w:w="12240" w:h="15840" w:code="1"/>
       <w:pgMar w:top="1440" w:right="1440" w:bottom="1440" w:left="1440" w:header="720" w:footer="576" w:gutter="0"/>
       <w:pgNumType w:start="1"/>
@@ -12593,10 +12363,19 @@
 </file>
 
 <file path=customXml/item1.xml><?xml version="1.0" encoding="utf-8"?>
+<?mso-contentType ?>
+<FormTemplates xmlns="http://schemas.microsoft.com/sharepoint/v3/contenttype/forms">
+  <Display>DocumentLibraryForm</Display>
+  <Edit>DocumentLibraryForm</Edit>
+  <New>DocumentLibraryForm</New>
+</FormTemplates>
+</file>
+
+<file path=customXml/item2.xml><?xml version="1.0" encoding="utf-8"?>
 <b:Sources xmlns:b="http://schemas.openxmlformats.org/officeDocument/2006/bibliography" xmlns="http://schemas.openxmlformats.org/officeDocument/2006/bibliography" SelectedStyle="\APA.XSL" StyleName="APA"/>
 </file>
 
-<file path=customXml/item2.xml><?xml version="1.0" encoding="utf-8"?>
+<file path=customXml/item3.xml><?xml version="1.0" encoding="utf-8"?>
 <ct:contentTypeSchema xmlns:ct="http://schemas.microsoft.com/office/2006/metadata/contentType" xmlns:ma="http://schemas.microsoft.com/office/2006/metadata/properties/metaAttributes" ct:_="" ma:_="" ma:contentTypeName="Document" ma:contentTypeID="0x010100E4CBB201245DCD488DE442BBA67EA1F2" ma:contentTypeVersion="18" ma:contentTypeDescription="Create a new document." ma:contentTypeScope="" ma:versionID="0e67aec752306b4b000fa6862159d8cb">
   <xsd:schema xmlns:xsd="http://www.w3.org/2001/XMLSchema" xmlns:xs="http://www.w3.org/2001/XMLSchema" xmlns:p="http://schemas.microsoft.com/office/2006/metadata/properties" xmlns:ns2="d902a471-6d23-409f-beeb-c1cf95669feb" xmlns:ns3="d3095238-afb0-46db-b5e2-5361e02e2315" targetNamespace="http://schemas.microsoft.com/office/2006/metadata/properties" ma:root="true" ma:fieldsID="20ee3e46f629b63a38b00c7d8dccbc3d" ns2:_="" ns3:_="">
     <xsd:import namespace="d902a471-6d23-409f-beeb-c1cf95669feb"/>
@@ -12851,15 +12630,6 @@
 </ct:contentTypeSchema>
 </file>
 
-<file path=customXml/item3.xml><?xml version="1.0" encoding="utf-8"?>
-<?mso-contentType ?>
-<FormTemplates xmlns="http://schemas.microsoft.com/sharepoint/v3/contenttype/forms">
-  <Display>DocumentLibraryForm</Display>
-  <Edit>DocumentLibraryForm</Edit>
-  <New>DocumentLibraryForm</New>
-</FormTemplates>
-</file>
-
 <file path=customXml/item4.xml><?xml version="1.0" encoding="utf-8"?>
 <p:properties xmlns:p="http://schemas.microsoft.com/office/2006/metadata/properties" xmlns:xsi="http://www.w3.org/2001/XMLSchema-instance" xmlns:pc="http://schemas.microsoft.com/office/infopath/2007/PartnerControls">
   <documentManagement>
@@ -12872,6 +12642,14 @@
 </file>
 
 <file path=customXml/itemProps1.xml><?xml version="1.0" encoding="utf-8"?>
+<ds:datastoreItem xmlns:ds="http://schemas.openxmlformats.org/officeDocument/2006/customXml" ds:itemID="{7E1385FD-1C11-4148-A7A0-CD62D9856BBD}">
+  <ds:schemaRefs>
+    <ds:schemaRef ds:uri="http://schemas.microsoft.com/sharepoint/v3/contenttype/forms"/>
+  </ds:schemaRefs>
+</ds:datastoreItem>
+</file>
+
+<file path=customXml/itemProps2.xml><?xml version="1.0" encoding="utf-8"?>
 <ds:datastoreItem xmlns:ds="http://schemas.openxmlformats.org/officeDocument/2006/customXml" ds:itemID="{00C98E1C-BD1C-42B2-9DB8-C2C4F656A8A9}">
   <ds:schemaRefs>
     <ds:schemaRef ds:uri="http://schemas.openxmlformats.org/officeDocument/2006/bibliography"/>
@@ -12879,14 +12657,32 @@
 </ds:datastoreItem>
 </file>
 
-<file path=customXml/itemProps2.xml><?xml version="1.0" encoding="utf-8"?>
-<ds:datastoreItem xmlns:ds="http://schemas.openxmlformats.org/officeDocument/2006/customXml" ds:itemID="{F675453A-D190-471E-96AA-2A44BE8CD232}"/>
-</file>
-
 <file path=customXml/itemProps3.xml><?xml version="1.0" encoding="utf-8"?>
-<ds:datastoreItem xmlns:ds="http://schemas.openxmlformats.org/officeDocument/2006/customXml" ds:itemID="{7E1385FD-1C11-4148-A7A0-CD62D9856BBD}"/>
+<ds:datastoreItem xmlns:ds="http://schemas.openxmlformats.org/officeDocument/2006/customXml" ds:itemID="{F675453A-D190-471E-96AA-2A44BE8CD232}">
+  <ds:schemaRefs>
+    <ds:schemaRef ds:uri="http://schemas.microsoft.com/office/2006/metadata/contentType"/>
+    <ds:schemaRef ds:uri="http://schemas.microsoft.com/office/2006/metadata/properties/metaAttributes"/>
+    <ds:schemaRef ds:uri="http://www.w3.org/2001/XMLSchema"/>
+    <ds:schemaRef ds:uri="http://schemas.microsoft.com/office/2006/metadata/properties"/>
+    <ds:schemaRef ds:uri="d902a471-6d23-409f-beeb-c1cf95669feb"/>
+    <ds:schemaRef ds:uri="d3095238-afb0-46db-b5e2-5361e02e2315"/>
+    <ds:schemaRef ds:uri="http://schemas.microsoft.com/office/2006/documentManagement/types"/>
+    <ds:schemaRef ds:uri="http://schemas.microsoft.com/office/infopath/2007/PartnerControls"/>
+    <ds:schemaRef ds:uri="http://schemas.openxmlformats.org/package/2006/metadata/core-properties"/>
+    <ds:schemaRef ds:uri="http://purl.org/dc/elements/1.1/"/>
+    <ds:schemaRef ds:uri="http://purl.org/dc/terms/"/>
+    <ds:schemaRef ds:uri="http://schemas.microsoft.com/internal/obd"/>
+  </ds:schemaRefs>
+</ds:datastoreItem>
 </file>
 
 <file path=customXml/itemProps4.xml><?xml version="1.0" encoding="utf-8"?>
-<ds:datastoreItem xmlns:ds="http://schemas.openxmlformats.org/officeDocument/2006/customXml" ds:itemID="{62B112DA-7BCE-4A10-B43E-4F5BF6BAC496}"/>
+<ds:datastoreItem xmlns:ds="http://schemas.openxmlformats.org/officeDocument/2006/customXml" ds:itemID="{62B112DA-7BCE-4A10-B43E-4F5BF6BAC496}">
+  <ds:schemaRefs>
+    <ds:schemaRef ds:uri="http://schemas.microsoft.com/office/2006/metadata/properties"/>
+    <ds:schemaRef ds:uri="http://schemas.microsoft.com/office/infopath/2007/PartnerControls"/>
+    <ds:schemaRef ds:uri="d902a471-6d23-409f-beeb-c1cf95669feb"/>
+    <ds:schemaRef ds:uri="d3095238-afb0-46db-b5e2-5361e02e2315"/>
+  </ds:schemaRefs>
+</ds:datastoreItem>
 </file>
</xml_diff>